<commit_message>
sửa lỗi tạo bài tập
</commit_message>
<xml_diff>
--- a/mau_de_100_trac_nghiem.docx
+++ b/mau_de_100_trac_nghiem.docx
@@ -4,12 +4,15 @@
   <w:body>
     <w:p>
       <w:r>
-        <w:t xml:space="preserve">ĐỀ MINH HỌA KIỂM TRA 100% TRẮC NGHIỆM TRUYỀN THỐNG</w:t>
-      </w:r>
-    </w:p>
-    <w:p>
-      <w:r>
-        <w:t xml:space="preserve">Môn thi: TOÁN HỌC - Thời gian làm bài: 45 phút</w:t>
+        <w:rPr>
+          <w:b/>
+        </w:rPr>
+        <w:t xml:space="preserve">ĐỀ MINH HỌA KIỂM TRA 100% TRẮC NGHIỆM TRUYỀN THỐNG (20 CÂU - 10.0 ĐIỂM)</w:t>
+      </w:r>
+    </w:p>
+    <w:p>
+      <w:r>
+        <w:t xml:space="preserve">Môn thi: TOÁN HỌC - Thời gian làm bài: 45 phút - Mỗi câu đúng được 0.5 điểm</w:t>
       </w:r>
     </w:p>
     <w:p/>
@@ -131,12 +134,476 @@
     <w:p/>
     <w:p>
       <w:r>
+        <w:rPr>
+          <w:b/>
+        </w:rPr>
+        <w:t xml:space="preserve">Câu 5: Họ tất cả các nguyên hàm của hàm số f(x) = cos(x) là:</w:t>
+      </w:r>
+    </w:p>
+    <w:p>
+      <w:r>
+        <w:t xml:space="preserve">A. -sin(x) + C</w:t>
+      </w:r>
+    </w:p>
+    <w:p>
+      <w:r>
+        <w:t xml:space="preserve">B. cos(x) + C</w:t>
+      </w:r>
+    </w:p>
+    <w:p>
+      <w:r>
+        <w:t xml:space="preserve">C. sin(x) + C*</w:t>
+      </w:r>
+    </w:p>
+    <w:p>
+      <w:r>
+        <w:t xml:space="preserve">D. -cos(x) + C</w:t>
+      </w:r>
+    </w:p>
+    <w:p/>
+    <w:p>
+      <w:r>
+        <w:rPr>
+          <w:b/>
+        </w:rPr>
+        <w:t xml:space="preserve">Câu 6: Tập nghiệm của bất phương trình log3(x - 2) &lt; 1 là:</w:t>
+      </w:r>
+    </w:p>
+    <w:p>
+      <w:r>
+        <w:t xml:space="preserve">A. (-inf; 5)</w:t>
+      </w:r>
+    </w:p>
+    <w:p>
+      <w:r>
+        <w:t xml:space="preserve">B. (2; +inf)</w:t>
+      </w:r>
+    </w:p>
+    <w:p>
+      <w:r>
+        <w:t xml:space="preserve">C. [2; 5)</w:t>
+      </w:r>
+    </w:p>
+    <w:p>
+      <w:r>
+        <w:t xml:space="preserve">D. (2; 5)*</w:t>
+      </w:r>
+    </w:p>
+    <w:p/>
+    <w:p>
+      <w:r>
+        <w:rPr>
+          <w:b/>
+        </w:rPr>
+        <w:t xml:space="preserve">Câu 7: Đường tiệm cận ngang của đồ thị hàm số y = (2x - 1)/(x + 1) là:</w:t>
+      </w:r>
+    </w:p>
+    <w:p>
+      <w:r>
+        <w:t xml:space="preserve">A. y = 2*</w:t>
+      </w:r>
+    </w:p>
+    <w:p>
+      <w:r>
+        <w:t xml:space="preserve">B. y = -1</w:t>
+      </w:r>
+    </w:p>
+    <w:p>
+      <w:r>
+        <w:t xml:space="preserve">C. x = -1</w:t>
+      </w:r>
+    </w:p>
+    <w:p>
+      <w:r>
+        <w:t xml:space="preserve">D. x = 2</w:t>
+      </w:r>
+    </w:p>
+    <w:p/>
+    <w:p>
+      <w:r>
+        <w:rPr>
+          <w:b/>
+        </w:rPr>
+        <w:t xml:space="preserve">Câu 8: Thể tích của khối chóp có diện tích đáy B = 6 và chiều cao h = 4 là:</w:t>
+      </w:r>
+    </w:p>
+    <w:p>
+      <w:r>
+        <w:t xml:space="preserve">A. 24</w:t>
+      </w:r>
+    </w:p>
+    <w:p>
+      <w:r>
+        <w:t xml:space="preserve">B. 8*</w:t>
+      </w:r>
+    </w:p>
+    <w:p>
+      <w:r>
+        <w:t xml:space="preserve">C. 12</w:t>
+      </w:r>
+    </w:p>
+    <w:p>
+      <w:r>
+        <w:t xml:space="preserve">D. 48</w:t>
+      </w:r>
+    </w:p>
+    <w:p/>
+    <w:p>
+      <w:r>
+        <w:rPr>
+          <w:b/>
+        </w:rPr>
+        <w:t xml:space="preserve">Câu 9: Thể tích của khối lăng trụ có diện tích đáy B = 5 và chiều cao h = 6 là:</w:t>
+      </w:r>
+    </w:p>
+    <w:p>
+      <w:r>
+        <w:t xml:space="preserve">A. 10</w:t>
+      </w:r>
+    </w:p>
+    <w:p>
+      <w:r>
+        <w:t xml:space="preserve">B. 15</w:t>
+      </w:r>
+    </w:p>
+    <w:p>
+      <w:r>
+        <w:t xml:space="preserve">C. 30*</w:t>
+      </w:r>
+    </w:p>
+    <w:p>
+      <w:r>
+        <w:t xml:space="preserve">D. 60</w:t>
+      </w:r>
+    </w:p>
+    <w:p/>
+    <w:p>
+      <w:r>
+        <w:rPr>
+          <w:b/>
+        </w:rPr>
+        <w:t xml:space="preserve">Câu 10: Trong không gian Oxyz, cho hai vectơ a = (1; -2; 3) và b = (2; 1; -1). Tích vô hướng a . b bằng:</w:t>
+      </w:r>
+    </w:p>
+    <w:p>
+      <w:r>
+        <w:t xml:space="preserve">A. -3*</w:t>
+      </w:r>
+    </w:p>
+    <w:p>
+      <w:r>
+        <w:t xml:space="preserve">B. 3</w:t>
+      </w:r>
+    </w:p>
+    <w:p>
+      <w:r>
+        <w:t xml:space="preserve">C. 5</w:t>
+      </w:r>
+    </w:p>
+    <w:p>
+      <w:r>
+        <w:t xml:space="preserve">D. -1</w:t>
+      </w:r>
+    </w:p>
+    <w:p/>
+    <w:p>
+      <w:r>
+        <w:rPr>
+          <w:b/>
+        </w:rPr>
+        <w:t xml:space="preserve">Câu 11: Trong không gian Oxyz, mặt cầu (S): (x - 1)^2 + (y + 2)^2 + (z - 3)^2 = 16 có bán kính bằng:</w:t>
+      </w:r>
+    </w:p>
+    <w:p>
+      <w:r>
+        <w:t xml:space="preserve">A. 16</w:t>
+      </w:r>
+    </w:p>
+    <w:p>
+      <w:r>
+        <w:t xml:space="preserve">B. 4*</w:t>
+      </w:r>
+    </w:p>
+    <w:p>
+      <w:r>
+        <w:t xml:space="preserve">C. 8</w:t>
+      </w:r>
+    </w:p>
+    <w:p>
+      <w:r>
+        <w:t xml:space="preserve">D. 2</w:t>
+      </w:r>
+    </w:p>
+    <w:p/>
+    <w:p>
+      <w:r>
+        <w:rPr>
+          <w:b/>
+        </w:rPr>
+        <w:t xml:space="preserve">Câu 12: Trong không gian Oxyz, một vectơ pháp tuyến của mặt phẳng (P): 2x - 3y + z - 5 = 0 là:</w:t>
+      </w:r>
+    </w:p>
+    <w:p>
+      <w:r>
+        <w:t xml:space="preserve">A. n = (2; 3; 1)</w:t>
+      </w:r>
+    </w:p>
+    <w:p>
+      <w:r>
+        <w:t xml:space="preserve">B. n = (2; -3; -5)</w:t>
+      </w:r>
+    </w:p>
+    <w:p>
+      <w:r>
+        <w:t xml:space="preserve">C. n = (-3; 1; -5)</w:t>
+      </w:r>
+    </w:p>
+    <w:p>
+      <w:r>
+        <w:t xml:space="preserve">D. n = (2; -3; 1)*</w:t>
+      </w:r>
+    </w:p>
+    <w:p/>
+    <w:p>
+      <w:r>
+        <w:rPr>
+          <w:b/>
+        </w:rPr>
+        <w:t xml:space="preserve">Câu 13: Cho số phức z = 3 - 4i. Môđun của số phức z bằng:</w:t>
+      </w:r>
+    </w:p>
+    <w:p>
+      <w:r>
+        <w:t xml:space="preserve">A. 5*</w:t>
+      </w:r>
+    </w:p>
+    <w:p>
+      <w:r>
+        <w:t xml:space="preserve">B. 7</w:t>
+      </w:r>
+    </w:p>
+    <w:p>
+      <w:r>
+        <w:t xml:space="preserve">C. 25</w:t>
+      </w:r>
+    </w:p>
+    <w:p>
+      <w:r>
+        <w:t xml:space="preserve">D. 1</w:t>
+      </w:r>
+    </w:p>
+    <w:p/>
+    <w:p>
+      <w:r>
+        <w:rPr>
+          <w:b/>
+        </w:rPr>
+        <w:t xml:space="preserve">Câu 14: Cho cấp số cộng (un) có u1 = 3 và công sai d = 4. Giá trị của u2 bằng:</w:t>
+      </w:r>
+    </w:p>
+    <w:p>
+      <w:r>
+        <w:t xml:space="preserve">A. -1</w:t>
+      </w:r>
+    </w:p>
+    <w:p>
+      <w:r>
+        <w:t xml:space="preserve">B. 12</w:t>
+      </w:r>
+    </w:p>
+    <w:p>
+      <w:r>
+        <w:t xml:space="preserve">C. 7*</w:t>
+      </w:r>
+    </w:p>
+    <w:p>
+      <w:r>
+        <w:t xml:space="preserve">D. 1</w:t>
+      </w:r>
+    </w:p>
+    <w:p/>
+    <w:p>
+      <w:r>
+        <w:rPr>
+          <w:b/>
+        </w:rPr>
+        <w:t xml:space="preserve">Câu 15: Số cách chọn 3 học sinh từ một nhóm gồm 10 học sinh là:</w:t>
+      </w:r>
+    </w:p>
+    <w:p>
+      <w:r>
+        <w:t xml:space="preserve">A. A_10^3</w:t>
+      </w:r>
+    </w:p>
+    <w:p>
+      <w:r>
+        <w:t xml:space="preserve">B. C_10^3*</w:t>
+      </w:r>
+    </w:p>
+    <w:p>
+      <w:r>
+        <w:t xml:space="preserve">C. 30</w:t>
+      </w:r>
+    </w:p>
+    <w:p>
+      <w:r>
+        <w:t xml:space="preserve">D. 10^3</w:t>
+      </w:r>
+    </w:p>
+    <w:p/>
+    <w:p>
+      <w:r>
+        <w:rPr>
+          <w:b/>
+        </w:rPr>
+        <w:t xml:space="preserve">Câu 16: Cho hàm số y = f(x) có bảng biến thiên với f'(x) &gt; 0 trên (-inf; 2) và f'(x) &lt; 0 trên (2; +inf). Hàm số đã cho đồng biến trên khoảng nào dưới đây?</w:t>
+      </w:r>
+    </w:p>
+    <w:p>
+      <w:r>
+        <w:t xml:space="preserve">A. (-inf; 2)*</w:t>
+      </w:r>
+    </w:p>
+    <w:p>
+      <w:r>
+        <w:t xml:space="preserve">B. (2; +inf)</w:t>
+      </w:r>
+    </w:p>
+    <w:p>
+      <w:r>
+        <w:t xml:space="preserve">C. (0; 3)</w:t>
+      </w:r>
+    </w:p>
+    <w:p>
+      <w:r>
+        <w:t xml:space="preserve">D. (-1; 5)</w:t>
+      </w:r>
+    </w:p>
+    <w:p/>
+    <w:p>
+      <w:r>
+        <w:rPr>
+          <w:b/>
+        </w:rPr>
+        <w:t xml:space="preserve">Câu 17: Giá trị nhỏ nhất của hàm số f(x) = x^3 - 3x trên đoạn [0; 2] bằng:</w:t>
+      </w:r>
+    </w:p>
+    <w:p>
+      <w:r>
+        <w:t xml:space="preserve">A. 0</w:t>
+      </w:r>
+    </w:p>
+    <w:p>
+      <w:r>
+        <w:t xml:space="preserve">B. 2</w:t>
+      </w:r>
+    </w:p>
+    <w:p>
+      <w:r>
+        <w:t xml:space="preserve">C. -1</w:t>
+      </w:r>
+    </w:p>
+    <w:p>
+      <w:r>
+        <w:t xml:space="preserve">D. -2*</w:t>
+      </w:r>
+    </w:p>
+    <w:p/>
+    <w:p>
+      <w:r>
+        <w:rPr>
+          <w:b/>
+        </w:rPr>
+        <w:t xml:space="preserve">Câu 18: Thể tích của khối nón có bán kính đáy r = 3 và chiều cao h = 4 là:</w:t>
+      </w:r>
+    </w:p>
+    <w:p>
+      <w:r>
+        <w:t xml:space="preserve">A. 36pi</w:t>
+      </w:r>
+    </w:p>
+    <w:p>
+      <w:r>
+        <w:t xml:space="preserve">B. 24pi</w:t>
+      </w:r>
+    </w:p>
+    <w:p>
+      <w:r>
+        <w:t xml:space="preserve">C. 12pi*</w:t>
+      </w:r>
+    </w:p>
+    <w:p>
+      <w:r>
+        <w:t xml:space="preserve">D. 48pi</w:t>
+      </w:r>
+    </w:p>
+    <w:p/>
+    <w:p>
+      <w:r>
+        <w:rPr>
+          <w:b/>
+        </w:rPr>
+        <w:t xml:space="preserve">Câu 19: Cho cấp số nhân (vn) có v1 = 2 và công bội q = 3. Giá trị của v3 bằng:</w:t>
+      </w:r>
+    </w:p>
+    <w:p>
+      <w:r>
+        <w:t xml:space="preserve">A. 6</w:t>
+      </w:r>
+    </w:p>
+    <w:p>
+      <w:r>
+        <w:t xml:space="preserve">B. 18*</w:t>
+      </w:r>
+    </w:p>
+    <w:p>
+      <w:r>
+        <w:t xml:space="preserve">C. 54</w:t>
+      </w:r>
+    </w:p>
+    <w:p>
+      <w:r>
+        <w:t xml:space="preserve">D. 8</w:t>
+      </w:r>
+    </w:p>
+    <w:p/>
+    <w:p>
+      <w:r>
+        <w:rPr>
+          <w:b/>
+        </w:rPr>
+        <w:t xml:space="preserve">Câu 20: Diện tích hình phẳng giới hạn bởi đồ thị hàm số y = x^2, trục hoành Ox và các đường thẳng x = 0, x = 3 là:</w:t>
+      </w:r>
+    </w:p>
+    <w:p>
+      <w:r>
+        <w:t xml:space="preserve">A. 9*</w:t>
+      </w:r>
+    </w:p>
+    <w:p>
+      <w:r>
+        <w:t xml:space="preserve">B. 27</w:t>
+      </w:r>
+    </w:p>
+    <w:p>
+      <w:r>
+        <w:t xml:space="preserve">C. 3</w:t>
+      </w:r>
+    </w:p>
+    <w:p>
+      <w:r>
+        <w:t xml:space="preserve">D. 6</w:t>
+      </w:r>
+    </w:p>
+    <w:p/>
+    <w:p>
+      <w:r>
         <w:t xml:space="preserve">BẢNG ĐÁP ÁN THAM KHẢO (NẾU KHÔNG ĐÁNH DẤU * TRONG ĐỀ):</w:t>
       </w:r>
     </w:p>
     <w:p>
       <w:r>
-        <w:t xml:space="preserve">Đáp án: 1C 2A 3B 4B</w:t>
+        <w:t xml:space="preserve">Đáp án: 1C 2A 3B 4B 5C 6D 7A 8B 9C 10A 11B 12D 13A 14C 15B 16A 17D 18C 19B 20A</w:t>
       </w:r>
     </w:p>
   </w:body>

</xml_diff>